<commit_message>
Refine book artwork and warm readable Word layout
</commit_message>
<xml_diff>
--- a/Encyclopedia_of_Cognition_Project/books/Doverie_Konflikt_i_Peresmotr_Editorial_Plan.docx
+++ b/Encyclopedia_of_Cognition_Project/books/Doverie_Konflikt_i_Peresmotr_Editorial_Plan.docx
@@ -1,10 +1,15 @@
 
 <file path=word/document.xml><?xml version="1.0" encoding="utf-8"?>
 <w:document xmlns:wpc="http://schemas.microsoft.com/office/word/2010/wordprocessingCanvas" xmlns:mo="http://schemas.microsoft.com/office/mac/office/2008/main" xmlns:mc="http://schemas.openxmlformats.org/markup-compatibility/2006" xmlns:mv="urn:schemas-microsoft-com:mac:vml" xmlns:o="urn:schemas-microsoft-com:office:office" xmlns:r="http://schemas.openxmlformats.org/officeDocument/2006/relationships" xmlns:m="http://schemas.openxmlformats.org/officeDocument/2006/math" xmlns:v="urn:schemas-microsoft-com:vml" xmlns:wp14="http://schemas.microsoft.com/office/word/2010/wordprocessingDrawing" xmlns:wp="http://schemas.openxmlformats.org/drawingml/2006/wordprocessingDrawing" xmlns:w10="urn:schemas-microsoft-com:office:word" xmlns:w="http://schemas.openxmlformats.org/wordprocessingml/2006/main" xmlns:w14="http://schemas.microsoft.com/office/word/2010/wordml" xmlns:wpg="http://schemas.microsoft.com/office/word/2010/wordprocessingGroup" xmlns:wpi="http://schemas.microsoft.com/office/word/2010/wordprocessingInk" xmlns:wne="http://schemas.microsoft.com/office/word/2006/wordml" xmlns:wps="http://schemas.microsoft.com/office/word/2010/wordprocessingShape" mc:Ignorable="w14 wp14">
+  <w:background w:color="F8F4EA"/>
   <w:body>
     <w:p>
       <w:pPr>
         <w:jc w:val="center"/>
+        <w:spacing w:before="80" w:after="180" w:line="300" w:lineRule="auto"/>
+        <w:pBdr>
+          <w:bottom w:val="single" w:sz="10" w:space="6" w:color="B39458"/>
+        </w:pBdr>
       </w:pPr>
       <w:r>
         <w:rPr>
@@ -28,6 +33,7 @@
     <w:p>
       <w:pPr>
         <w:jc w:val="center"/>
+        <w:spacing w:after="80" w:line="270" w:lineRule="auto"/>
       </w:pPr>
       <w:r>
         <w:rPr>
@@ -43,6 +49,10 @@
     <w:p>
       <w:pPr>
         <w:jc w:val="center"/>
+        <w:spacing w:before="80" w:after="180" w:line="300" w:lineRule="auto"/>
+        <w:pBdr>
+          <w:bottom w:val="single" w:sz="10" w:space="6" w:color="B39458"/>
+        </w:pBdr>
       </w:pPr>
       <w:r>
         <w:rPr>
@@ -57,6 +67,7 @@
     <w:p>
       <w:pPr>
         <w:jc w:val="center"/>
+        <w:spacing w:after="80" w:line="270" w:lineRule="auto"/>
       </w:pPr>
       <w:r>
         <w:rPr>
@@ -69,6 +80,7 @@
     <w:p>
       <w:pPr>
         <w:jc w:val="center"/>
+        <w:spacing w:after="80" w:line="270" w:lineRule="auto"/>
       </w:pPr>
       <w:r>
         <w:rPr>
@@ -87,12 +99,19 @@
     <w:p>
       <w:pPr>
         <w:pStyle w:val="Title"/>
+        <w:spacing w:before="80" w:after="180" w:line="300" w:lineRule="auto"/>
+        <w:pBdr>
+          <w:bottom w:val="single" w:sz="10" w:space="6" w:color="B39458"/>
+        </w:pBdr>
       </w:pPr>
       <w:r>
         <w:t>Оглавление</w:t>
       </w:r>
     </w:p>
     <w:p>
+      <w:pPr>
+        <w:spacing w:after="80" w:line="270" w:lineRule="auto"/>
+      </w:pPr>
       <w:r>
         <w:rPr>
           <w:i/>
@@ -103,6 +122,9 @@
       <w:fldSimple w:instr="TOC \o &quot;1-2&quot; \h \z \u"/>
     </w:p>
     <w:p>
+      <w:pPr>
+        <w:spacing w:after="80" w:line="270" w:lineRule="auto"/>
+      </w:pPr>
       <w:r>
         <w:rPr>
           <w:b/>
@@ -121,12 +143,21 @@
     <w:p>
       <w:pPr>
         <w:pStyle w:val="Heading1"/>
+        <w:shd w:val="clear" w:color="auto" w:fill="E4EEEC"/>
+        <w:spacing w:before="260" w:after="100" w:line="280" w:lineRule="auto"/>
+        <w:pBdr>
+          <w:bottom w:val="single" w:sz="8" w:space="6" w:color="4B7777"/>
+        </w:pBdr>
       </w:pPr>
       <w:r>
         <w:t>Статус и границы документа</w:t>
       </w:r>
     </w:p>
     <w:p>
+      <w:pPr>
+        <w:shd w:val="clear" w:color="auto" w:fill="EEE8DA"/>
+        <w:spacing w:before="80" w:after="100" w:line="270" w:lineRule="auto"/>
+      </w:pPr>
       <w:r>
         <w:rPr>
           <w:b/>
@@ -138,6 +169,9 @@
       </w:r>
     </w:p>
     <w:p>
+      <w:pPr>
+        <w:spacing w:after="80" w:line="270" w:lineRule="auto"/>
+      </w:pPr>
       <w:r>
         <w:t>Ниже собран полный план книги: замысел, читатель, синтетический учебный пример, структура из пяти частей и двадцати глав, основания и границы выводов, а также задачи до перехода к рукописи.</w:t>
       </w:r>
@@ -145,12 +179,20 @@
     <w:p>
       <w:pPr>
         <w:pStyle w:val="Heading1"/>
+        <w:shd w:val="clear" w:color="auto" w:fill="E4EEEC"/>
+        <w:spacing w:before="260" w:after="100" w:line="280" w:lineRule="auto"/>
+        <w:pBdr>
+          <w:bottom w:val="single" w:sz="8" w:space="6" w:color="4B7777"/>
+        </w:pBdr>
       </w:pPr>
       <w:r>
         <w:t>Замысел и читатель</w:t>
       </w:r>
     </w:p>
     <w:p>
+      <w:pPr>
+        <w:spacing w:after="80" w:line="270" w:lineRule="auto"/>
+      </w:pPr>
       <w:r>
         <w:t>Книга о надёжном цифровом напарнике — не обещание безошибочного ИИ, а способ понимать основания ответов, оспаривать выводы и исправлять последствия ошибки. Темы доверия: происхождение утверждения, основания и независимость подтверждений, применимость по времени и версии, условия пересмотра, разрешённые полномочия системы.</w:t>
         <w:br/>
@@ -161,12 +203,21 @@
     <w:p>
       <w:pPr>
         <w:pStyle w:val="Heading1"/>
+        <w:shd w:val="clear" w:color="auto" w:fill="E4EEEC"/>
+        <w:spacing w:before="260" w:after="100" w:line="280" w:lineRule="auto"/>
+        <w:pBdr>
+          <w:bottom w:val="single" w:sz="8" w:space="6" w:color="4B7777"/>
+        </w:pBdr>
       </w:pPr>
       <w:r>
         <w:t>Сквозной учебный пример</w:t>
       </w:r>
     </w:p>
     <w:p>
+      <w:pPr>
+        <w:shd w:val="clear" w:color="auto" w:fill="EEE8DA"/>
+        <w:spacing w:before="80" w:after="100" w:line="270" w:lineRule="auto"/>
+      </w:pPr>
       <w:r>
         <w:t>Явно синтетическая учебная история, не реальное событие: помощник предлагает поставщика Б; пересказ превращает это в «решение пользователя»; другие агенты повторяют одну запись; позже готовится письмо без исходного подтверждения. Не представлять этот сюжет как реальное событие владельца.</w:t>
       </w:r>
@@ -214,6 +265,8 @@
       <w:pPr>
         <w:pStyle w:val="CaptionRU"/>
         <w:jc w:val="center"/>
+        <w:shd w:val="clear" w:color="auto" w:fill="F4F0E6"/>
+        <w:spacing w:before="40" w:after="160" w:line="250" w:lineRule="auto"/>
       </w:pPr>
       <w:r>
         <w:t>Доверие и сотрудничество — человек и цифровой напарник изучают одну карту. Художественная метафора.</w:t>
@@ -222,6 +275,11 @@
     <w:p>
       <w:pPr>
         <w:pStyle w:val="Heading1"/>
+        <w:shd w:val="clear" w:color="auto" w:fill="E4EEEC"/>
+        <w:spacing w:before="260" w:after="100" w:line="280" w:lineRule="auto"/>
+        <w:pBdr>
+          <w:bottom w:val="single" w:sz="8" w:space="6" w:color="4B7777"/>
+        </w:pBdr>
       </w:pPr>
       <w:r>
         <w:t>Оглавление книги</w:t>
@@ -230,6 +288,8 @@
     <w:p>
       <w:pPr>
         <w:pStyle w:val="Heading2"/>
+        <w:shd w:val="clear" w:color="auto" w:fill="F0EEE6"/>
+        <w:spacing w:before="180" w:after="60" w:line="270" w:lineRule="auto"/>
       </w:pPr>
       <w:r>
         <w:t>Пролог — «Но я этого не решал».</w:t>
@@ -238,6 +298,8 @@
     <w:p>
       <w:pPr>
         <w:pStyle w:val="Heading2"/>
+        <w:shd w:val="clear" w:color="auto" w:fill="F0EEE6"/>
+        <w:spacing w:before="180" w:after="60" w:line="270" w:lineRule="auto"/>
       </w:pPr>
       <w:r>
         <w:t>Часть I. Чьи слова живут в памяти.</w:t>
@@ -246,6 +308,7 @@
     <w:p>
       <w:pPr>
         <w:pStyle w:val="ListNumber"/>
+        <w:spacing w:after="80" w:line="270" w:lineRule="auto"/>
       </w:pPr>
       <w:r>
         <w:t>1. Память — не стенограмма и не истина.</w:t>
@@ -254,6 +317,7 @@
     <w:p>
       <w:pPr>
         <w:pStyle w:val="ListNumber"/>
+        <w:spacing w:after="80" w:line="270" w:lineRule="auto"/>
       </w:pPr>
       <w:r>
         <w:t>2. Пять различий, которые нельзя потерять.</w:t>
@@ -262,6 +326,7 @@
     <w:p>
       <w:pPr>
         <w:pStyle w:val="ListNumber"/>
+        <w:spacing w:after="80" w:line="270" w:lineRule="auto"/>
       </w:pPr>
       <w:r>
         <w:t>3. Как предложение становится чужим убеждением.</w:t>
@@ -270,6 +335,7 @@
     <w:p>
       <w:pPr>
         <w:pStyle w:val="ListNumber"/>
+        <w:spacing w:after="80" w:line="270" w:lineRule="auto"/>
       </w:pPr>
       <w:r>
         <w:t>4. Источник должен пережить запись, повтор и поиск.</w:t>
@@ -278,6 +344,8 @@
     <w:p>
       <w:pPr>
         <w:pStyle w:val="Heading2"/>
+        <w:shd w:val="clear" w:color="auto" w:fill="F0EEE6"/>
+        <w:spacing w:before="180" w:after="60" w:line="270" w:lineRule="auto"/>
       </w:pPr>
       <w:r>
         <w:t>Часть II. Почему согласие ещё ничего не доказывает.</w:t>
@@ -286,6 +354,7 @@
     <w:p>
       <w:pPr>
         <w:pStyle w:val="ListNumber"/>
+        <w:spacing w:after="80" w:line="270" w:lineRule="auto"/>
       </w:pPr>
       <w:r>
         <w:t>1. Пять голосов или одно эхо?</w:t>
@@ -294,6 +363,7 @@
     <w:p>
       <w:pPr>
         <w:pStyle w:val="ListNumber"/>
+        <w:spacing w:after="80" w:line="270" w:lineRule="auto"/>
       </w:pPr>
       <w:r>
         <w:t>2. Считать нужно основания, а не пересказы.</w:t>
@@ -302,6 +372,7 @@
     <w:p>
       <w:pPr>
         <w:pStyle w:val="ListNumber"/>
+        <w:spacing w:after="80" w:line="270" w:lineRule="auto"/>
       </w:pPr>
       <w:r>
         <w:t>3. Когда кворум должен отказаться от ответа.</w:t>
@@ -310,6 +381,7 @@
     <w:p>
       <w:pPr>
         <w:pStyle w:val="ListNumber"/>
+        <w:spacing w:after="80" w:line="270" w:lineRule="auto"/>
       </w:pPr>
       <w:r>
         <w:t>4. Что действительно показал эксперимент.</w:t>
@@ -318,6 +390,8 @@
     <w:p>
       <w:pPr>
         <w:pStyle w:val="Heading2"/>
+        <w:shd w:val="clear" w:color="auto" w:fill="F0EEE6"/>
+        <w:spacing w:before="180" w:after="60" w:line="270" w:lineRule="auto"/>
       </w:pPr>
       <w:r>
         <w:t>Часть III. Как заметить настоящий конфликт.</w:t>
@@ -326,6 +400,7 @@
     <w:p>
       <w:pPr>
         <w:pStyle w:val="ListNumber"/>
+        <w:spacing w:after="80" w:line="270" w:lineRule="auto"/>
       </w:pPr>
       <w:r>
         <w:t>1. Противоречие, уточнение или другой случай?</w:t>
@@ -334,6 +409,7 @@
     <w:p>
       <w:pPr>
         <w:pStyle w:val="ListNumber"/>
+        <w:spacing w:after="80" w:line="270" w:lineRule="auto"/>
       </w:pPr>
       <w:r>
         <w:t>2. Маленькое «не», которое меняет всё.</w:t>
@@ -342,6 +418,7 @@
     <w:p>
       <w:pPr>
         <w:pStyle w:val="ListNumber"/>
+        <w:spacing w:after="80" w:line="270" w:lineRule="auto"/>
       </w:pPr>
       <w:r>
         <w:t>3. Почему счётчик новых сообщений — плохой судья.</w:t>
@@ -350,6 +427,7 @@
     <w:p>
       <w:pPr>
         <w:pStyle w:val="ListNumber"/>
+        <w:spacing w:after="80" w:line="270" w:lineRule="auto"/>
       </w:pPr>
       <w:r>
         <w:t>4. Не пропустить изменение и не пересматривать бесконечно.</w:t>
@@ -358,6 +436,8 @@
     <w:p>
       <w:pPr>
         <w:pStyle w:val="Heading2"/>
+        <w:shd w:val="clear" w:color="auto" w:fill="F0EEE6"/>
+        <w:spacing w:before="180" w:after="60" w:line="270" w:lineRule="auto"/>
       </w:pPr>
       <w:r>
         <w:t>Часть IV. Пересмотр без стирания истории.</w:t>
@@ -366,6 +446,7 @@
     <w:p>
       <w:pPr>
         <w:pStyle w:val="ListNumber"/>
+        <w:spacing w:after="80" w:line="270" w:lineRule="auto"/>
       </w:pPr>
       <w:r>
         <w:t>1. Сигнал конфликта — ещё не новый вывод.</w:t>
@@ -374,6 +455,7 @@
     <w:p>
       <w:pPr>
         <w:pStyle w:val="ListNumber"/>
+        <w:spacing w:after="80" w:line="270" w:lineRule="auto"/>
       </w:pPr>
       <w:r>
         <w:t>2. Что делать с прежним основанием.</w:t>
@@ -382,6 +464,7 @@
     <w:p>
       <w:pPr>
         <w:pStyle w:val="ListNumber"/>
+        <w:spacing w:after="80" w:line="270" w:lineRule="auto"/>
       </w:pPr>
       <w:r>
         <w:t>3. Как заменить вывод и сохранить преемственность.</w:t>
@@ -390,6 +473,7 @@
     <w:p>
       <w:pPr>
         <w:pStyle w:val="ListNumber"/>
+        <w:spacing w:after="80" w:line="270" w:lineRule="auto"/>
       </w:pPr>
       <w:r>
         <w:t>4. Человек возражает — что именно меняется?</w:t>
@@ -398,6 +482,8 @@
     <w:p>
       <w:pPr>
         <w:pStyle w:val="Heading2"/>
+        <w:shd w:val="clear" w:color="auto" w:fill="F0EEE6"/>
+        <w:spacing w:before="180" w:after="60" w:line="270" w:lineRule="auto"/>
       </w:pPr>
       <w:r>
         <w:t>Часть V. Доверие проверяется действием.</w:t>
@@ -406,6 +492,7 @@
     <w:p>
       <w:pPr>
         <w:pStyle w:val="ListNumber"/>
+        <w:spacing w:after="80" w:line="270" w:lineRule="auto"/>
       </w:pPr>
       <w:r>
         <w:t>1. Знать, предлагать и иметь право — разные вещи.</w:t>
@@ -414,6 +501,7 @@
     <w:p>
       <w:pPr>
         <w:pStyle w:val="ListNumber"/>
+        <w:spacing w:after="80" w:line="270" w:lineRule="auto"/>
       </w:pPr>
       <w:r>
         <w:t>2. Инициатива без присвоения воли.</w:t>
@@ -422,6 +510,7 @@
     <w:p>
       <w:pPr>
         <w:pStyle w:val="ListNumber"/>
+        <w:spacing w:after="80" w:line="270" w:lineRule="auto"/>
       </w:pPr>
       <w:r>
         <w:t>3. Проверка после паузы.</w:t>
@@ -430,6 +519,7 @@
     <w:p>
       <w:pPr>
         <w:pStyle w:val="ListNumber"/>
+        <w:spacing w:after="80" w:line="270" w:lineRule="auto"/>
       </w:pPr>
       <w:r>
         <w:t>4. Чему мы вправе доверять после успешного теста.</w:t>
@@ -438,6 +528,8 @@
     <w:p>
       <w:pPr>
         <w:pStyle w:val="Heading2"/>
+        <w:shd w:val="clear" w:color="auto" w:fill="F0EEE6"/>
+        <w:spacing w:before="180" w:after="60" w:line="270" w:lineRule="auto"/>
       </w:pPr>
       <w:r>
         <w:t>Эпилог — «Надёжность — это возможность исправить».</w:t>
@@ -446,6 +538,7 @@
     <w:p>
       <w:pPr>
         <w:pStyle w:val="IntenseQuote"/>
+        <w:spacing w:after="80" w:line="270" w:lineRule="auto"/>
       </w:pPr>
       <w:r>
         <w:t>Начальный порядок рукописи: пролог, главы 3 и 17, затем 8 и 11.</w:t>
@@ -459,6 +552,10 @@
     <w:p>
       <w:pPr>
         <w:pStyle w:val="Title"/>
+        <w:spacing w:before="80" w:after="180" w:line="300" w:lineRule="auto"/>
+        <w:pBdr>
+          <w:bottom w:val="single" w:sz="10" w:space="6" w:color="B39458"/>
+        </w:pBdr>
       </w:pPr>
       <w:r>
         <w:t>Развёрнутый редакционный каркас</w:t>
@@ -467,12 +564,20 @@
     <w:p>
       <w:pPr>
         <w:pStyle w:val="Heading1"/>
+        <w:shd w:val="clear" w:color="auto" w:fill="E4EEEC"/>
+        <w:spacing w:before="260" w:after="100" w:line="280" w:lineRule="auto"/>
+        <w:pBdr>
+          <w:bottom w:val="single" w:sz="8" w:space="6" w:color="4B7777"/>
+        </w:pBdr>
       </w:pPr>
       <w:r>
         <w:t>Пролог — «Но я этого не решал».</w:t>
       </w:r>
     </w:p>
     <w:p>
+      <w:pPr>
+        <w:spacing w:after="80" w:line="270" w:lineRule="auto"/>
+      </w:pPr>
       <w:r>
         <w:t>Функция в книге: задать рамку вопроса и связать его с центральным тезисом о доверии, конфликте и исправлении.</w:t>
       </w:r>
@@ -480,6 +585,11 @@
     <w:p>
       <w:pPr>
         <w:pStyle w:val="Heading1"/>
+        <w:shd w:val="clear" w:color="auto" w:fill="E4EEEC"/>
+        <w:spacing w:before="260" w:after="100" w:line="280" w:lineRule="auto"/>
+        <w:pBdr>
+          <w:bottom w:val="single" w:sz="8" w:space="6" w:color="4B7777"/>
+        </w:pBdr>
       </w:pPr>
       <w:r>
         <w:t>Часть I. Чьи слова живут в памяти.</w:t>
@@ -528,6 +638,8 @@
       <w:pPr>
         <w:pStyle w:val="CaptionRU"/>
         <w:jc w:val="center"/>
+        <w:shd w:val="clear" w:color="auto" w:fill="F4F0E6"/>
+        <w:spacing w:before="40" w:after="160" w:line="250" w:lineRule="auto"/>
       </w:pPr>
       <w:r>
         <w:t>Память и происхождение — повторения одного источника не становятся независимыми основаниями. Художественная метафора.</w:t>
@@ -536,12 +648,17 @@
     <w:p>
       <w:pPr>
         <w:pStyle w:val="Heading2"/>
+        <w:shd w:val="clear" w:color="auto" w:fill="F0EEE6"/>
+        <w:spacing w:before="180" w:after="60" w:line="270" w:lineRule="auto"/>
       </w:pPr>
       <w:r>
         <w:t>1. Память — не стенограмма и не истина.</w:t>
       </w:r>
     </w:p>
     <w:p>
+      <w:pPr>
+        <w:spacing w:after="80" w:line="270" w:lineRule="auto"/>
+      </w:pPr>
       <w:r>
         <w:t>Редакционный узел: определить, какие основания, источники, условия применимости и полномочия нужно удержать в этой главе; отделить проверяемые утверждения от гипотез и предложений.</w:t>
       </w:r>
@@ -549,12 +666,17 @@
     <w:p>
       <w:pPr>
         <w:pStyle w:val="Heading2"/>
+        <w:shd w:val="clear" w:color="auto" w:fill="F0EEE6"/>
+        <w:spacing w:before="180" w:after="60" w:line="270" w:lineRule="auto"/>
       </w:pPr>
       <w:r>
         <w:t>2. Пять различий, которые нельзя потерять.</w:t>
       </w:r>
     </w:p>
     <w:p>
+      <w:pPr>
+        <w:spacing w:after="80" w:line="270" w:lineRule="auto"/>
+      </w:pPr>
       <w:r>
         <w:t>Редакционный узел: определить, какие основания, источники, условия применимости и полномочия нужно удержать в этой главе; отделить проверяемые утверждения от гипотез и предложений.</w:t>
       </w:r>
@@ -562,12 +684,17 @@
     <w:p>
       <w:pPr>
         <w:pStyle w:val="Heading2"/>
+        <w:shd w:val="clear" w:color="auto" w:fill="F0EEE6"/>
+        <w:spacing w:before="180" w:after="60" w:line="270" w:lineRule="auto"/>
       </w:pPr>
       <w:r>
         <w:t>3. Как предложение становится чужим убеждением.</w:t>
       </w:r>
     </w:p>
     <w:p>
+      <w:pPr>
+        <w:spacing w:after="80" w:line="270" w:lineRule="auto"/>
+      </w:pPr>
       <w:r>
         <w:t>Редакционный узел: определить, какие основания, источники, условия применимости и полномочия нужно удержать в этой главе; отделить проверяемые утверждения от гипотез и предложений.</w:t>
       </w:r>
@@ -575,12 +702,17 @@
     <w:p>
       <w:pPr>
         <w:pStyle w:val="Heading2"/>
+        <w:shd w:val="clear" w:color="auto" w:fill="F0EEE6"/>
+        <w:spacing w:before="180" w:after="60" w:line="270" w:lineRule="auto"/>
       </w:pPr>
       <w:r>
         <w:t>4. Источник должен пережить запись, повтор и поиск.</w:t>
       </w:r>
     </w:p>
     <w:p>
+      <w:pPr>
+        <w:spacing w:after="80" w:line="270" w:lineRule="auto"/>
+      </w:pPr>
       <w:r>
         <w:t>Редакционный узел: определить, какие основания, источники, условия применимости и полномочия нужно удержать в этой главе; отделить проверяемые утверждения от гипотез и предложений.</w:t>
       </w:r>
@@ -588,6 +720,11 @@
     <w:p>
       <w:pPr>
         <w:pStyle w:val="Heading1"/>
+        <w:shd w:val="clear" w:color="auto" w:fill="E4EEEC"/>
+        <w:spacing w:before="260" w:after="100" w:line="280" w:lineRule="auto"/>
+        <w:pBdr>
+          <w:bottom w:val="single" w:sz="8" w:space="6" w:color="4B7777"/>
+        </w:pBdr>
       </w:pPr>
       <w:r>
         <w:t>Часть II. Почему согласие ещё ничего не доказывает.</w:t>
@@ -636,6 +773,8 @@
       <w:pPr>
         <w:pStyle w:val="CaptionRU"/>
         <w:jc w:val="center"/>
+        <w:shd w:val="clear" w:color="auto" w:fill="F4F0E6"/>
+        <w:spacing w:before="40" w:after="160" w:line="250" w:lineRule="auto"/>
       </w:pPr>
       <w:r>
         <w:t>Память и происхождение — повторения одного источника не становятся независимыми основаниями. Художественная метафора.</w:t>
@@ -644,12 +783,17 @@
     <w:p>
       <w:pPr>
         <w:pStyle w:val="Heading2"/>
+        <w:shd w:val="clear" w:color="auto" w:fill="F0EEE6"/>
+        <w:spacing w:before="180" w:after="60" w:line="270" w:lineRule="auto"/>
       </w:pPr>
       <w:r>
         <w:t>1. Пять голосов или одно эхо?</w:t>
       </w:r>
     </w:p>
     <w:p>
+      <w:pPr>
+        <w:spacing w:after="80" w:line="270" w:lineRule="auto"/>
+      </w:pPr>
       <w:r>
         <w:t>Редакционный узел: определить, какие основания, источники, условия применимости и полномочия нужно удержать в этой главе; отделить проверяемые утверждения от гипотез и предложений.</w:t>
       </w:r>
@@ -657,12 +801,17 @@
     <w:p>
       <w:pPr>
         <w:pStyle w:val="Heading2"/>
+        <w:shd w:val="clear" w:color="auto" w:fill="F0EEE6"/>
+        <w:spacing w:before="180" w:after="60" w:line="270" w:lineRule="auto"/>
       </w:pPr>
       <w:r>
         <w:t>2. Считать нужно основания, а не пересказы.</w:t>
       </w:r>
     </w:p>
     <w:p>
+      <w:pPr>
+        <w:spacing w:after="80" w:line="270" w:lineRule="auto"/>
+      </w:pPr>
       <w:r>
         <w:t>Редакционный узел: определить, какие основания, источники, условия применимости и полномочия нужно удержать в этой главе; отделить проверяемые утверждения от гипотез и предложений.</w:t>
       </w:r>
@@ -670,12 +819,17 @@
     <w:p>
       <w:pPr>
         <w:pStyle w:val="Heading2"/>
+        <w:shd w:val="clear" w:color="auto" w:fill="F0EEE6"/>
+        <w:spacing w:before="180" w:after="60" w:line="270" w:lineRule="auto"/>
       </w:pPr>
       <w:r>
         <w:t>3. Когда кворум должен отказаться от ответа.</w:t>
       </w:r>
     </w:p>
     <w:p>
+      <w:pPr>
+        <w:spacing w:after="80" w:line="270" w:lineRule="auto"/>
+      </w:pPr>
       <w:r>
         <w:t>Редакционный узел: определить, какие основания, источники, условия применимости и полномочия нужно удержать в этой главе; отделить проверяемые утверждения от гипотез и предложений.</w:t>
       </w:r>
@@ -683,12 +837,17 @@
     <w:p>
       <w:pPr>
         <w:pStyle w:val="Heading2"/>
+        <w:shd w:val="clear" w:color="auto" w:fill="F0EEE6"/>
+        <w:spacing w:before="180" w:after="60" w:line="270" w:lineRule="auto"/>
       </w:pPr>
       <w:r>
         <w:t>4. Что действительно показал эксперимент.</w:t>
       </w:r>
     </w:p>
     <w:p>
+      <w:pPr>
+        <w:spacing w:after="80" w:line="270" w:lineRule="auto"/>
+      </w:pPr>
       <w:r>
         <w:t>Редакционный узел: определить, какие основания, источники, условия применимости и полномочия нужно удержать в этой главе; отделить проверяемые утверждения от гипотез и предложений.</w:t>
       </w:r>
@@ -696,6 +855,11 @@
     <w:p>
       <w:pPr>
         <w:pStyle w:val="Heading1"/>
+        <w:shd w:val="clear" w:color="auto" w:fill="E4EEEC"/>
+        <w:spacing w:before="260" w:after="100" w:line="280" w:lineRule="auto"/>
+        <w:pBdr>
+          <w:bottom w:val="single" w:sz="8" w:space="6" w:color="4B7777"/>
+        </w:pBdr>
       </w:pPr>
       <w:r>
         <w:t>Часть III. Как заметить настоящий конфликт.</w:t>
@@ -744,6 +908,8 @@
       <w:pPr>
         <w:pStyle w:val="CaptionRU"/>
         <w:jc w:val="center"/>
+        <w:shd w:val="clear" w:color="auto" w:fill="F4F0E6"/>
+        <w:spacing w:before="40" w:after="160" w:line="250" w:lineRule="auto"/>
       </w:pPr>
       <w:r>
         <w:t>Память и происхождение — повторения одного источника не становятся независимыми основаниями. Художественная метафора.</w:t>
@@ -752,12 +918,17 @@
     <w:p>
       <w:pPr>
         <w:pStyle w:val="Heading2"/>
+        <w:shd w:val="clear" w:color="auto" w:fill="F0EEE6"/>
+        <w:spacing w:before="180" w:after="60" w:line="270" w:lineRule="auto"/>
       </w:pPr>
       <w:r>
         <w:t>1. Противоречие, уточнение или другой случай?</w:t>
       </w:r>
     </w:p>
     <w:p>
+      <w:pPr>
+        <w:spacing w:after="80" w:line="270" w:lineRule="auto"/>
+      </w:pPr>
       <w:r>
         <w:t>Редакционный узел: определить, какие основания, источники, условия применимости и полномочия нужно удержать в этой главе; отделить проверяемые утверждения от гипотез и предложений.</w:t>
       </w:r>
@@ -765,12 +936,17 @@
     <w:p>
       <w:pPr>
         <w:pStyle w:val="Heading2"/>
+        <w:shd w:val="clear" w:color="auto" w:fill="F0EEE6"/>
+        <w:spacing w:before="180" w:after="60" w:line="270" w:lineRule="auto"/>
       </w:pPr>
       <w:r>
         <w:t>2. Маленькое «не», которое меняет всё.</w:t>
       </w:r>
     </w:p>
     <w:p>
+      <w:pPr>
+        <w:spacing w:after="80" w:line="270" w:lineRule="auto"/>
+      </w:pPr>
       <w:r>
         <w:t>Редакционный узел: определить, какие основания, источники, условия применимости и полномочия нужно удержать в этой главе; отделить проверяемые утверждения от гипотез и предложений.</w:t>
       </w:r>
@@ -778,12 +954,17 @@
     <w:p>
       <w:pPr>
         <w:pStyle w:val="Heading2"/>
+        <w:shd w:val="clear" w:color="auto" w:fill="F0EEE6"/>
+        <w:spacing w:before="180" w:after="60" w:line="270" w:lineRule="auto"/>
       </w:pPr>
       <w:r>
         <w:t>3. Почему счётчик новых сообщений — плохой судья.</w:t>
       </w:r>
     </w:p>
     <w:p>
+      <w:pPr>
+        <w:spacing w:after="80" w:line="270" w:lineRule="auto"/>
+      </w:pPr>
       <w:r>
         <w:t>Редакционный узел: определить, какие основания, источники, условия применимости и полномочия нужно удержать в этой главе; отделить проверяемые утверждения от гипотез и предложений.</w:t>
       </w:r>
@@ -791,12 +972,17 @@
     <w:p>
       <w:pPr>
         <w:pStyle w:val="Heading2"/>
+        <w:shd w:val="clear" w:color="auto" w:fill="F0EEE6"/>
+        <w:spacing w:before="180" w:after="60" w:line="270" w:lineRule="auto"/>
       </w:pPr>
       <w:r>
         <w:t>4. Не пропустить изменение и не пересматривать бесконечно.</w:t>
       </w:r>
     </w:p>
     <w:p>
+      <w:pPr>
+        <w:spacing w:after="80" w:line="270" w:lineRule="auto"/>
+      </w:pPr>
       <w:r>
         <w:t>Редакционный узел: определить, какие основания, источники, условия применимости и полномочия нужно удержать в этой главе; отделить проверяемые утверждения от гипотез и предложений.</w:t>
       </w:r>
@@ -804,6 +990,11 @@
     <w:p>
       <w:pPr>
         <w:pStyle w:val="Heading1"/>
+        <w:shd w:val="clear" w:color="auto" w:fill="E4EEEC"/>
+        <w:spacing w:before="260" w:after="100" w:line="280" w:lineRule="auto"/>
+        <w:pBdr>
+          <w:bottom w:val="single" w:sz="8" w:space="6" w:color="4B7777"/>
+        </w:pBdr>
       </w:pPr>
       <w:r>
         <w:t>Часть IV. Пересмотр без стирания истории.</w:t>
@@ -852,6 +1043,8 @@
       <w:pPr>
         <w:pStyle w:val="CaptionRU"/>
         <w:jc w:val="center"/>
+        <w:shd w:val="clear" w:color="auto" w:fill="F4F0E6"/>
+        <w:spacing w:before="40" w:after="160" w:line="250" w:lineRule="auto"/>
       </w:pPr>
       <w:r>
         <w:t>Память и происхождение — повторения одного источника не становятся независимыми основаниями. Художественная метафора.</w:t>
@@ -900,6 +1093,8 @@
       <w:pPr>
         <w:pStyle w:val="CaptionRU"/>
         <w:jc w:val="center"/>
+        <w:shd w:val="clear" w:color="auto" w:fill="F4F0E6"/>
+        <w:spacing w:before="40" w:after="160" w:line="250" w:lineRule="auto"/>
       </w:pPr>
       <w:r>
         <w:t>Конфликт и пересмотр — новый маршрут сохраняет связь с прежним. Художественная метафора.</w:t>
@@ -908,12 +1103,17 @@
     <w:p>
       <w:pPr>
         <w:pStyle w:val="Heading2"/>
+        <w:shd w:val="clear" w:color="auto" w:fill="F0EEE6"/>
+        <w:spacing w:before="180" w:after="60" w:line="270" w:lineRule="auto"/>
       </w:pPr>
       <w:r>
         <w:t>1. Сигнал конфликта — ещё не новый вывод.</w:t>
       </w:r>
     </w:p>
     <w:p>
+      <w:pPr>
+        <w:spacing w:after="80" w:line="270" w:lineRule="auto"/>
+      </w:pPr>
       <w:r>
         <w:t>Редакционный узел: определить, какие основания, источники, условия применимости и полномочия нужно удержать в этой главе; отделить проверяемые утверждения от гипотез и предложений.</w:t>
       </w:r>
@@ -921,12 +1121,17 @@
     <w:p>
       <w:pPr>
         <w:pStyle w:val="Heading2"/>
+        <w:shd w:val="clear" w:color="auto" w:fill="F0EEE6"/>
+        <w:spacing w:before="180" w:after="60" w:line="270" w:lineRule="auto"/>
       </w:pPr>
       <w:r>
         <w:t>2. Что делать с прежним основанием.</w:t>
       </w:r>
     </w:p>
     <w:p>
+      <w:pPr>
+        <w:spacing w:after="80" w:line="270" w:lineRule="auto"/>
+      </w:pPr>
       <w:r>
         <w:t>Редакционный узел: определить, какие основания, источники, условия применимости и полномочия нужно удержать в этой главе; отделить проверяемые утверждения от гипотез и предложений.</w:t>
       </w:r>
@@ -934,12 +1139,17 @@
     <w:p>
       <w:pPr>
         <w:pStyle w:val="Heading2"/>
+        <w:shd w:val="clear" w:color="auto" w:fill="F0EEE6"/>
+        <w:spacing w:before="180" w:after="60" w:line="270" w:lineRule="auto"/>
       </w:pPr>
       <w:r>
         <w:t>3. Как заменить вывод и сохранить преемственность.</w:t>
       </w:r>
     </w:p>
     <w:p>
+      <w:pPr>
+        <w:spacing w:after="80" w:line="270" w:lineRule="auto"/>
+      </w:pPr>
       <w:r>
         <w:t>Редакционный узел: определить, какие основания, источники, условия применимости и полномочия нужно удержать в этой главе; отделить проверяемые утверждения от гипотез и предложений.</w:t>
       </w:r>
@@ -947,12 +1157,17 @@
     <w:p>
       <w:pPr>
         <w:pStyle w:val="Heading2"/>
+        <w:shd w:val="clear" w:color="auto" w:fill="F0EEE6"/>
+        <w:spacing w:before="180" w:after="60" w:line="270" w:lineRule="auto"/>
       </w:pPr>
       <w:r>
         <w:t>4. Человек возражает — что именно меняется?</w:t>
       </w:r>
     </w:p>
     <w:p>
+      <w:pPr>
+        <w:spacing w:after="80" w:line="270" w:lineRule="auto"/>
+      </w:pPr>
       <w:r>
         <w:t>Редакционный узел: определить, какие основания, источники, условия применимости и полномочия нужно удержать в этой главе; отделить проверяемые утверждения от гипотез и предложений.</w:t>
       </w:r>
@@ -960,6 +1175,11 @@
     <w:p>
       <w:pPr>
         <w:pStyle w:val="Heading1"/>
+        <w:shd w:val="clear" w:color="auto" w:fill="E4EEEC"/>
+        <w:spacing w:before="260" w:after="100" w:line="280" w:lineRule="auto"/>
+        <w:pBdr>
+          <w:bottom w:val="single" w:sz="8" w:space="6" w:color="4B7777"/>
+        </w:pBdr>
       </w:pPr>
       <w:r>
         <w:t>Часть V. Доверие проверяется действием.</w:t>
@@ -968,12 +1188,17 @@
     <w:p>
       <w:pPr>
         <w:pStyle w:val="Heading2"/>
+        <w:shd w:val="clear" w:color="auto" w:fill="F0EEE6"/>
+        <w:spacing w:before="180" w:after="60" w:line="270" w:lineRule="auto"/>
       </w:pPr>
       <w:r>
         <w:t>1. Знать, предлагать и иметь право — разные вещи.</w:t>
       </w:r>
     </w:p>
     <w:p>
+      <w:pPr>
+        <w:spacing w:after="80" w:line="270" w:lineRule="auto"/>
+      </w:pPr>
       <w:r>
         <w:t>Редакционный узел: определить, какие основания, источники, условия применимости и полномочия нужно удержать в этой главе; отделить проверяемые утверждения от гипотез и предложений.</w:t>
       </w:r>
@@ -981,12 +1206,17 @@
     <w:p>
       <w:pPr>
         <w:pStyle w:val="Heading2"/>
+        <w:shd w:val="clear" w:color="auto" w:fill="F0EEE6"/>
+        <w:spacing w:before="180" w:after="60" w:line="270" w:lineRule="auto"/>
       </w:pPr>
       <w:r>
         <w:t>2. Инициатива без присвоения воли.</w:t>
       </w:r>
     </w:p>
     <w:p>
+      <w:pPr>
+        <w:spacing w:after="80" w:line="270" w:lineRule="auto"/>
+      </w:pPr>
       <w:r>
         <w:t>Редакционный узел: определить, какие основания, источники, условия применимости и полномочия нужно удержать в этой главе; отделить проверяемые утверждения от гипотез и предложений.</w:t>
       </w:r>
@@ -994,12 +1224,17 @@
     <w:p>
       <w:pPr>
         <w:pStyle w:val="Heading2"/>
+        <w:shd w:val="clear" w:color="auto" w:fill="F0EEE6"/>
+        <w:spacing w:before="180" w:after="60" w:line="270" w:lineRule="auto"/>
       </w:pPr>
       <w:r>
         <w:t>3. Проверка после паузы.</w:t>
       </w:r>
     </w:p>
     <w:p>
+      <w:pPr>
+        <w:spacing w:after="80" w:line="270" w:lineRule="auto"/>
+      </w:pPr>
       <w:r>
         <w:t>Редакционный узел: определить, какие основания, источники, условия применимости и полномочия нужно удержать в этой главе; отделить проверяемые утверждения от гипотез и предложений.</w:t>
       </w:r>
@@ -1007,12 +1242,17 @@
     <w:p>
       <w:pPr>
         <w:pStyle w:val="Heading2"/>
+        <w:shd w:val="clear" w:color="auto" w:fill="F0EEE6"/>
+        <w:spacing w:before="180" w:after="60" w:line="270" w:lineRule="auto"/>
       </w:pPr>
       <w:r>
         <w:t>4. Чему мы вправе доверять после успешного теста.</w:t>
       </w:r>
     </w:p>
     <w:p>
+      <w:pPr>
+        <w:spacing w:after="80" w:line="270" w:lineRule="auto"/>
+      </w:pPr>
       <w:r>
         <w:t>Редакционный узел: определить, какие основания, источники, условия применимости и полномочия нужно удержать в этой главе; отделить проверяемые утверждения от гипотез и предложений.</w:t>
       </w:r>
@@ -1020,12 +1260,20 @@
     <w:p>
       <w:pPr>
         <w:pStyle w:val="Heading1"/>
+        <w:shd w:val="clear" w:color="auto" w:fill="E4EEEC"/>
+        <w:spacing w:before="260" w:after="100" w:line="280" w:lineRule="auto"/>
+        <w:pBdr>
+          <w:bottom w:val="single" w:sz="8" w:space="6" w:color="4B7777"/>
+        </w:pBdr>
       </w:pPr>
       <w:r>
         <w:t>Эпилог — «Надёжность — это возможность исправить».</w:t>
       </w:r>
     </w:p>
     <w:p>
+      <w:pPr>
+        <w:spacing w:after="80" w:line="270" w:lineRule="auto"/>
+      </w:pPr>
       <w:r>
         <w:t>Функция в книге: задать рамку вопроса и связать его с центральным тезисом о доверии, конфликте и исправлении.</w:t>
       </w:r>
@@ -1033,6 +1281,11 @@
     <w:p>
       <w:pPr>
         <w:pStyle w:val="Heading1"/>
+        <w:shd w:val="clear" w:color="auto" w:fill="E4EEEC"/>
+        <w:spacing w:before="260" w:after="100" w:line="280" w:lineRule="auto"/>
+        <w:pBdr>
+          <w:bottom w:val="single" w:sz="8" w:space="6" w:color="4B7777"/>
+        </w:pBdr>
       </w:pPr>
       <w:r>
         <w:t>Имеющиеся основы и границы выводов</w:t>
@@ -1041,6 +1294,7 @@
     <w:p>
       <w:pPr>
         <w:pStyle w:val="ListBullet"/>
+        <w:spacing w:after="80" w:line="270" w:lineRule="auto"/>
       </w:pPr>
       <w:hyperlink r:id="rId12">
         <w:r>
@@ -1058,6 +1312,7 @@
     <w:p>
       <w:pPr>
         <w:pStyle w:val="ListBullet"/>
+        <w:spacing w:after="80" w:line="270" w:lineRule="auto"/>
       </w:pPr>
       <w:hyperlink r:id="rId13">
         <w:r>
@@ -1075,6 +1330,7 @@
     <w:p>
       <w:pPr>
         <w:pStyle w:val="ListBullet"/>
+        <w:spacing w:after="80" w:line="270" w:lineRule="auto"/>
       </w:pPr>
       <w:hyperlink r:id="rId14">
         <w:r>
@@ -1090,6 +1346,10 @@
       </w:r>
     </w:p>
     <w:p>
+      <w:pPr>
+        <w:shd w:val="clear" w:color="auto" w:fill="EEE8DA"/>
+        <w:spacing w:before="80" w:after="100" w:line="270" w:lineRule="auto"/>
+      </w:pPr>
       <w:r>
         <w:t>Предложение Crystal V6 ещё не означает реализованный механизм. CLASS-1 PASS не доказывает универсальную эффективность. Надёжную память или инициативу не выдавать за доказательство сознания.</w:t>
       </w:r>
@@ -1097,6 +1357,11 @@
     <w:p>
       <w:pPr>
         <w:pStyle w:val="Heading1"/>
+        <w:shd w:val="clear" w:color="auto" w:fill="E4EEEC"/>
+        <w:spacing w:before="260" w:after="100" w:line="280" w:lineRule="auto"/>
+        <w:pBdr>
+          <w:bottom w:val="single" w:sz="8" w:space="6" w:color="4B7777"/>
+        </w:pBdr>
       </w:pPr>
       <w:r>
         <w:t>Что нужно до рукописи</w:t>
@@ -1105,6 +1370,7 @@
     <w:p>
       <w:pPr>
         <w:pStyle w:val="ListBullet"/>
+        <w:spacing w:after="80" w:line="270" w:lineRule="auto"/>
       </w:pPr>
       <w:r>
         <w:t>Обзор литературы об изменении убеждений и происхождении данных.</w:t>
@@ -1113,6 +1379,7 @@
     <w:p>
       <w:pPr>
         <w:pStyle w:val="ListBullet"/>
+        <w:spacing w:after="80" w:line="270" w:lineRule="auto"/>
       </w:pPr>
       <w:r>
         <w:t>Независимые тесты кворума, отрицаний и устаревших источников.</w:t>
@@ -1121,6 +1388,7 @@
     <w:p>
       <w:pPr>
         <w:pStyle w:val="ListBullet"/>
+        <w:spacing w:after="80" w:line="270" w:lineRule="auto"/>
       </w:pPr>
       <w:r>
         <w:t>Механизм преемственности старого и нового вывода.</w:t>
@@ -1129,6 +1397,7 @@
     <w:p>
       <w:pPr>
         <w:pStyle w:val="ListBullet"/>
+        <w:spacing w:after="80" w:line="270" w:lineRule="auto"/>
       </w:pPr>
       <w:r>
         <w:t>Сквозная проверка от записи до возобновления сессии.</w:t>
@@ -1137,6 +1406,8 @@
     <w:p>
       <w:pPr>
         <w:pStyle w:val="ListBullet"/>
+        <w:shd w:val="clear" w:color="auto" w:fill="EEE8DA"/>
+        <w:spacing w:before="80" w:after="100" w:line="270" w:lineRule="auto"/>
       </w:pPr>
       <w:r>
         <w:t>Авторские ответы о границах доверия — их нельзя выдумывать за автора.</w:t>
@@ -1553,7 +1824,7 @@
     <w:rsid w:val="00FC693F"/>
     <w:rPr>
       <w:rFonts w:ascii="Aptos" w:hAnsi="Aptos" w:eastAsia="Aptos"/>
-      <w:color w:val="28303A"/>
+      <w:color w:val="2F3437"/>
       <w:sz w:val="21"/>
     </w:rPr>
   </w:style>
@@ -1619,9 +1890,10 @@
       <w:rFonts w:asciiTheme="majorHAnsi" w:eastAsiaTheme="majorEastAsia" w:hAnsiTheme="majorHAnsi" w:cstheme="majorBidi" w:ascii="Aptos Display" w:hAnsi="Aptos Display" w:eastAsia="Aptos Display"/>
       <w:b/>
       <w:bCs/>
-      <w:color w:val="1F526D"/>
+      <w:color w:val="4B7777"/>
       <w:sz w:val="40"/>
       <w:szCs w:val="28"/>
+      <w:shd w:val="clear" w:fill="E4EEEC"/>
     </w:rPr>
   </w:style>
   <w:style w:type="paragraph" w:styleId="Heading2">
@@ -1643,9 +1915,10 @@
       <w:rFonts w:asciiTheme="majorHAnsi" w:eastAsiaTheme="majorEastAsia" w:hAnsiTheme="majorHAnsi" w:cstheme="majorBidi" w:ascii="Aptos Display" w:hAnsi="Aptos Display" w:eastAsia="Aptos Display"/>
       <w:b/>
       <w:bCs/>
-      <w:color w:val="316982"/>
+      <w:color w:val="4B7777"/>
       <w:sz w:val="28"/>
       <w:szCs w:val="26"/>
+      <w:shd w:val="clear" w:fill="F0EEE6"/>
     </w:rPr>
   </w:style>
   <w:style w:type="paragraph" w:styleId="Heading3">
@@ -1908,7 +2181,7 @@
     <w:rPr>
       <w:rFonts w:asciiTheme="majorHAnsi" w:eastAsiaTheme="majorEastAsia" w:hAnsiTheme="majorHAnsi" w:cstheme="majorBidi" w:ascii="Aptos Display" w:hAnsi="Aptos Display" w:eastAsia="Aptos Display"/>
       <w:b/>
-      <w:color w:val="1F3C53"/>
+      <w:color w:val="4B7777"/>
       <w:spacing w:val="5"/>
       <w:kern w:val="28"/>
       <w:sz w:val="64"/>
@@ -13247,7 +13520,7 @@
     <w:rPr>
       <w:rFonts w:ascii="Aptos" w:hAnsi="Aptos"/>
       <w:i/>
-      <w:color w:val="5A646E"/>
+      <w:color w:val="2F3437"/>
       <w:sz w:val="18"/>
     </w:rPr>
   </w:style>

</xml_diff>